<commit_message>
Actualizacion de contenidos, datos de atractivos/planes y promo agosto 2026
</commit_message>
<xml_diff>
--- a/docs/plan_turistico_exclusivo/Plan salento filandia Y ocaso.docx
+++ b/docs/plan_turistico_exclusivo/Plan salento filandia Y ocaso.docx
@@ -12,6 +12,15 @@
           <w:szCs w:val="20"/>
         </w:rPr>
       </w:pPr>
+      <w:r>
+        <w:rPr>
+          <w:rFonts w:ascii="Arial" w:hAnsi="Arial" w:cs="Arial"/>
+          <w:b/>
+          <w:sz w:val="20"/>
+          <w:szCs w:val="20"/>
+        </w:rPr>
+        <w:t>PLAN TURÍSTICO CON INMERSIÓN CAFETERA, PAISAJES Y PUEBLOS QUINDIANOS.</w:t>
+      </w:r>
     </w:p>
     <w:p>
       <w:pPr>
@@ -29,7 +38,26 @@
           <w:sz w:val="20"/>
           <w:szCs w:val="20"/>
         </w:rPr>
-        <w:t>CUATRO (4) DIAS, TRES (3) NOCHES (TARIFA POR PERSONA): INCLUYE:</w:t>
+        <w:t xml:space="preserve">CUATRO (4) DIAS, TRES (3) NOCHES (TARIFA POR PERSONA): </w:t>
+      </w:r>
+      <w:r>
+        <w:rPr>
+          <w:rFonts w:ascii="Arial" w:hAnsi="Arial" w:cs="Arial"/>
+          <w:bCs/>
+          <w:sz w:val="20"/>
+          <w:szCs w:val="20"/>
+        </w:rPr>
+        <w:t xml:space="preserve">INCLUYE </w:t>
+      </w:r>
+      <w:bookmarkStart w:id="0" w:name="_Hlk188024615"/>
+      <w:r>
+        <w:rPr>
+          <w:rFonts w:ascii="Arial" w:hAnsi="Arial" w:cs="Arial"/>
+          <w:bCs/>
+          <w:sz w:val="20"/>
+          <w:szCs w:val="20"/>
+        </w:rPr>
+        <w:t>3 NOCHES DE ALOJAMAIENTO, ALOJAMIENTO</w:t>
       </w:r>
       <w:r>
         <w:rPr>
@@ -43,13 +71,44 @@
       <w:r>
         <w:rPr>
           <w:rFonts w:ascii="Arial" w:hAnsi="Arial" w:cs="Arial"/>
+          <w:sz w:val="20"/>
+          <w:szCs w:val="20"/>
+        </w:rPr>
+        <w:t xml:space="preserve">HOTEL VISTA HERMOSA </w:t>
+      </w:r>
+      <w:r>
+        <w:rPr>
+          <w:rFonts w:ascii="Arial" w:hAnsi="Arial" w:cs="Arial"/>
+          <w:sz w:val="20"/>
+          <w:szCs w:val="20"/>
+        </w:rPr>
+        <w:t xml:space="preserve">O SIMILAR </w:t>
+      </w:r>
+      <w:r>
+        <w:rPr>
+          <w:rFonts w:ascii="Arial" w:hAnsi="Arial" w:cs="Arial"/>
+          <w:sz w:val="20"/>
+          <w:szCs w:val="20"/>
+        </w:rPr>
+        <w:t xml:space="preserve">EN </w:t>
+      </w:r>
+      <w:r>
+        <w:rPr>
+          <w:rFonts w:ascii="Arial" w:hAnsi="Arial" w:cs="Arial"/>
+          <w:sz w:val="20"/>
+          <w:szCs w:val="20"/>
+        </w:rPr>
+        <w:t xml:space="preserve">SALENTO, </w:t>
+      </w:r>
+      <w:r>
+        <w:rPr>
+          <w:rFonts w:ascii="Arial" w:hAnsi="Arial" w:cs="Arial"/>
           <w:bCs/>
           <w:sz w:val="20"/>
           <w:szCs w:val="20"/>
         </w:rPr>
-        <w:t xml:space="preserve"> INCLUYE </w:t>
-      </w:r>
-      <w:bookmarkStart w:id="0" w:name="_Hlk188024615"/>
+        <w:t xml:space="preserve">3 </w:t>
+      </w:r>
       <w:r>
         <w:rPr>
           <w:rFonts w:ascii="Arial" w:hAnsi="Arial" w:cs="Arial"/>
@@ -57,12 +116,21 @@
           <w:sz w:val="20"/>
           <w:szCs w:val="20"/>
         </w:rPr>
-        <w:t>ALOJAMIENTO</w:t>
-      </w:r>
-      <w:r>
-        <w:rPr>
-          <w:rFonts w:ascii="Arial" w:hAnsi="Arial" w:cs="Arial"/>
-          <w:b/>
+        <w:t>DESAYUNOS. (</w:t>
+      </w:r>
+      <w:r>
+        <w:rPr>
+          <w:rFonts w:ascii="Arial" w:hAnsi="Arial" w:cs="Arial"/>
+          <w:bCs/>
+          <w:sz w:val="20"/>
+          <w:szCs w:val="20"/>
+        </w:rPr>
+        <w:t>SOLO INCLUYE DESAYUNOS)</w:t>
+      </w:r>
+      <w:r>
+        <w:rPr>
+          <w:rFonts w:ascii="Arial" w:hAnsi="Arial" w:cs="Arial"/>
+          <w:bCs/>
           <w:sz w:val="20"/>
           <w:szCs w:val="20"/>
         </w:rPr>
@@ -71,23 +139,7 @@
       <w:r>
         <w:rPr>
           <w:rFonts w:ascii="Arial" w:hAnsi="Arial" w:cs="Arial"/>
-          <w:sz w:val="20"/>
-          <w:szCs w:val="20"/>
-        </w:rPr>
-        <w:t>HOTEL VISTA HERMOSA EN SALENTO</w:t>
-      </w:r>
-      <w:r>
-        <w:rPr>
-          <w:rFonts w:ascii="Arial" w:hAnsi="Arial" w:cs="Arial"/>
-          <w:sz w:val="20"/>
-          <w:szCs w:val="20"/>
-        </w:rPr>
-        <w:t xml:space="preserve"> O SIMILAR, </w:t>
-      </w:r>
-      <w:r>
-        <w:rPr>
-          <w:rFonts w:ascii="Arial" w:hAnsi="Arial" w:cs="Arial"/>
-          <w:b/>
+          <w:bCs/>
           <w:sz w:val="20"/>
           <w:szCs w:val="20"/>
         </w:rPr>
@@ -96,10 +148,19 @@
       <w:r>
         <w:rPr>
           <w:rFonts w:ascii="Arial" w:hAnsi="Arial" w:cs="Arial"/>
-          <w:sz w:val="20"/>
-          <w:szCs w:val="20"/>
-        </w:rPr>
-        <w:t xml:space="preserve"> VALLE DE </w:t>
+          <w:bCs/>
+          <w:sz w:val="20"/>
+          <w:szCs w:val="20"/>
+        </w:rPr>
+        <w:t xml:space="preserve"> </w:t>
+      </w:r>
+      <w:r>
+        <w:rPr>
+          <w:rFonts w:ascii="Arial" w:hAnsi="Arial" w:cs="Arial"/>
+          <w:sz w:val="20"/>
+          <w:szCs w:val="20"/>
+        </w:rPr>
+        <w:t xml:space="preserve">VALLE DE </w:t>
       </w:r>
       <w:r>
         <w:rPr>
@@ -115,23 +176,47 @@
           <w:sz w:val="20"/>
           <w:szCs w:val="20"/>
         </w:rPr>
-        <w:t xml:space="preserve"> MIRADOR EL ENCANTO,</w:t>
-      </w:r>
-      <w:r>
-        <w:rPr>
-          <w:rFonts w:ascii="Arial" w:hAnsi="Arial" w:cs="Arial"/>
-          <w:sz w:val="20"/>
-          <w:szCs w:val="20"/>
-        </w:rPr>
-        <w:t xml:space="preserve"> VISITAR </w:t>
-      </w:r>
-      <w:r>
-        <w:rPr>
-          <w:rFonts w:ascii="Arial" w:hAnsi="Arial" w:cs="Arial"/>
-          <w:sz w:val="20"/>
-          <w:szCs w:val="20"/>
-        </w:rPr>
-        <w:t>FILANDIA SU MIRADOR EL MUSEO DEL CANASTO Y LA CALLE DEL TIEMPO DETENIDA</w:t>
+        <w:t xml:space="preserve"> MIRADOR EL </w:t>
+      </w:r>
+      <w:r>
+        <w:rPr>
+          <w:rFonts w:ascii="Arial" w:hAnsi="Arial" w:cs="Arial"/>
+          <w:sz w:val="20"/>
+          <w:szCs w:val="20"/>
+        </w:rPr>
+        <w:t>BOSQUE, VISITAR</w:t>
+      </w:r>
+      <w:r>
+        <w:rPr>
+          <w:rFonts w:ascii="Arial" w:hAnsi="Arial" w:cs="Arial"/>
+          <w:sz w:val="20"/>
+          <w:szCs w:val="20"/>
+        </w:rPr>
+        <w:t xml:space="preserve"> </w:t>
+      </w:r>
+      <w:r>
+        <w:rPr>
+          <w:rFonts w:ascii="Arial" w:hAnsi="Arial" w:cs="Arial"/>
+          <w:sz w:val="20"/>
+          <w:szCs w:val="20"/>
+        </w:rPr>
+        <w:t xml:space="preserve">FILANDIA SU </w:t>
+      </w:r>
+      <w:r>
+        <w:rPr>
+          <w:rFonts w:ascii="Arial" w:hAnsi="Arial" w:cs="Arial"/>
+          <w:sz w:val="20"/>
+          <w:szCs w:val="20"/>
+        </w:rPr>
+        <w:t>MIRADOR, EL</w:t>
+      </w:r>
+      <w:r>
+        <w:rPr>
+          <w:rFonts w:ascii="Arial" w:hAnsi="Arial" w:cs="Arial"/>
+          <w:sz w:val="20"/>
+          <w:szCs w:val="20"/>
+        </w:rPr>
+        <w:t xml:space="preserve"> MUSEO DEL CANASTO Y LA CALLE DEL TIEMPO DETENIDA</w:t>
       </w:r>
       <w:bookmarkEnd w:id="0"/>
       <w:r>
@@ -164,7 +249,39 @@
           <w:sz w:val="20"/>
           <w:szCs w:val="20"/>
         </w:rPr>
-        <w:t xml:space="preserve">AEROPUERRTO DE PEREIRA A HOTEL EN </w:t>
+        <w:t xml:space="preserve">AEROPUERRTO DE PEREIRA </w:t>
+      </w:r>
+      <w:r>
+        <w:rPr>
+          <w:rFonts w:ascii="Arial" w:hAnsi="Arial" w:cs="Arial"/>
+          <w:sz w:val="20"/>
+          <w:szCs w:val="20"/>
+        </w:rPr>
+        <w:t xml:space="preserve">O ARMENIS </w:t>
+      </w:r>
+      <w:r>
+        <w:rPr>
+          <w:rFonts w:ascii="Arial" w:hAnsi="Arial" w:cs="Arial"/>
+          <w:sz w:val="20"/>
+          <w:szCs w:val="20"/>
+        </w:rPr>
+        <w:t>A</w:t>
+      </w:r>
+      <w:r>
+        <w:rPr>
+          <w:rFonts w:ascii="Arial" w:hAnsi="Arial" w:cs="Arial"/>
+          <w:sz w:val="20"/>
+          <w:szCs w:val="20"/>
+        </w:rPr>
+        <w:t>L</w:t>
+      </w:r>
+      <w:r>
+        <w:rPr>
+          <w:rFonts w:ascii="Arial" w:hAnsi="Arial" w:cs="Arial"/>
+          <w:sz w:val="20"/>
+          <w:szCs w:val="20"/>
+        </w:rPr>
+        <w:t xml:space="preserve"> HOTEL EN </w:t>
       </w:r>
       <w:r>
         <w:rPr>
@@ -198,6 +315,14 @@
         </w:rPr>
         <w:t>Y REGRESO AEROPUERTO DE PEREIRA</w:t>
       </w:r>
+      <w:r>
+        <w:rPr>
+          <w:rFonts w:ascii="Arial" w:hAnsi="Arial" w:cs="Arial"/>
+          <w:sz w:val="20"/>
+          <w:szCs w:val="20"/>
+        </w:rPr>
+        <w:t xml:space="preserve"> O ARMENIA.</w:t>
+      </w:r>
     </w:p>
     <w:p>
       <w:pPr>
@@ -212,7 +337,19 @@
         <w:t xml:space="preserve">1 DIA. Traslado </w:t>
       </w:r>
       <w:r>
-        <w:t xml:space="preserve">desde aeropuerto de Pereira a hotel </w:t>
+        <w:t xml:space="preserve">desde aeropuerto de Pereira </w:t>
+      </w:r>
+      <w:r>
+        <w:t xml:space="preserve">o Armenia </w:t>
+      </w:r>
+      <w:r>
+        <w:t>a</w:t>
+      </w:r>
+      <w:r>
+        <w:t>l</w:t>
+      </w:r>
+      <w:r>
+        <w:t xml:space="preserve"> hotel </w:t>
       </w:r>
       <w:r>
         <w:t xml:space="preserve">Vista Hermosa </w:t>
@@ -229,6 +366,9 @@
         <w:t xml:space="preserve">2 DIA. </w:t>
       </w:r>
       <w:r>
+        <w:t xml:space="preserve">Desayuno, </w:t>
+      </w:r>
+      <w:r>
         <w:t>10</w:t>
       </w:r>
       <w:r>
@@ -279,7 +419,13 @@
         <w:t xml:space="preserve">3 </w:t>
       </w:r>
       <w:r>
-        <w:t>DIA 8.30</w:t>
+        <w:t xml:space="preserve">DIA </w:t>
+      </w:r>
+      <w:r>
+        <w:t xml:space="preserve">Desayuno, </w:t>
+      </w:r>
+      <w:r>
+        <w:t>8.30</w:t>
       </w:r>
       <w:r>
         <w:t xml:space="preserve"> a.m. </w:t>
@@ -326,10 +472,19 @@
         <w:t xml:space="preserve">4 </w:t>
       </w:r>
       <w:r>
-        <w:t xml:space="preserve">DIA </w:t>
-      </w:r>
-      <w:r>
-        <w:t>Traslado a aeropuerto de Pereira.</w:t>
+        <w:t xml:space="preserve">DIA Desayuno, </w:t>
+      </w:r>
+      <w:r>
+        <w:t>Traslado a aeropuerto de Pereira</w:t>
+      </w:r>
+      <w:r>
+        <w:t xml:space="preserve"> </w:t>
+      </w:r>
+      <w:r>
+        <w:t xml:space="preserve">o Armenia </w:t>
+      </w:r>
+      <w:r>
+        <w:t>y despedida.</w:t>
       </w:r>
     </w:p>
     <w:p>

</xml_diff>